<commit_message>
docs: add CREST postal address to payment reminder
Co-Authored-By: Claude Opus 5.5 <noreply@anthropic.com>
Claude-Session: https://claude.ai/code/session_018mwURQtyHfocEY8Umw9GHv
</commit_message>
<xml_diff>
--- a/knowledge/projects/crest-investment/2026-10-20-Zahlungserinnerung-CREST.docx
+++ b/knowledge/projects/crest-investment/2026-10-20-Zahlungserinnerung-CREST.docx
@@ -54,9 +54,9 @@
         </w:rPr>
         <w:t>CREST Investment GmbH</w:t>
         <w:br/>
-        <w:t>[Straße Hausnummer]</w:t>
+        <w:t>Liesborner Weg 19</w:t>
         <w:br/>
-        <w:t>[PLZ Ort]</w:t>
+        <w:t>13507 Berlin</w:t>
       </w:r>
     </w:p>
     <w:p>

</xml_diff>